<commit_message>
docs(apply): 제출 패키지 Word 본 갱신(KISTI 원고 반영)
Co-Authored-By: Claude Sonnet 5.5 <noreply@anthropic.com>
Claude-Session: https://claude.ai/code/session_01SB3Kb3dUky5rKPgY7HJoGz
</commit_message>
<xml_diff>
--- a/docs/apply/submission-pack-2026-10-06.docx
+++ b/docs/apply/submission-pack-2026-10-06.docx
@@ -2891,16 +2891,37 @@
           <w:rFonts w:ascii="Malgun Gothic" w:hAnsi="Malgun Gothic" w:eastAsia="Malgun Gothic" w:cs="Malgun Gothic"/>
           <w:b w:val="0"/>
         </w:rPr>
-        <w:t>9. 11-25 · KISTI DATA·AI 분석 — 이중 출품 개요(원고 미작성)</w:t>
+        <w:t>9. 11-25 · KISTI DATA·AI 분석 — 이중 출품</w:t>
       </w:r>
     </w:p>
     <w:p>
       <w:r>
         <w:rPr>
           <w:rFonts w:ascii="Malgun Gothic" w:hAnsi="Malgun Gothic" w:eastAsia="Malgun Gothic" w:cs="Malgun Gothic"/>
+          <w:b/>
+        </w:rPr>
+        <w:t>만든 것.</w:t>
+      </w:r>
+      <w:r>
+        <w:rPr>
+          <w:rFonts w:ascii="Malgun Gothic" w:hAnsi="Malgun Gothic" w:eastAsia="Malgun Gothic" w:cs="Malgun Gothic"/>
           <w:b w:val="0"/>
         </w:rPr>
-        <w:t>부문 규정(팀 인원·제출물)을 원문으로 확인하기 전에는 쓰지 않는다. 가능하다면 다음과 같이 나눈다.</w:t>
+        <w:t xml:space="preserve"> [13-kisti/problem-discovery.md](13-kisti/problem-discovery.md)(문제발굴) · [13-kisti/problem-solving.md](13-kisti/problem-solving.md)(문제해결). 제출용 Word 본은 `_submit/13-kisti-*.docx`. </w:t>
+      </w:r>
+      <w:r>
+        <w:rPr>
+          <w:rFonts w:ascii="Malgun Gothic" w:hAnsi="Malgun Gothic" w:eastAsia="Malgun Gothic" w:cs="Malgun Gothic"/>
+          <w:b/>
+        </w:rPr>
+        <w:t>부문 규정(팀 인원·제출 형식·두 부문 동시 출품 가능 여부)을 원문으로 확인하기 전에는 제출하지 않는다.</w:t>
+      </w:r>
+      <w:r>
+        <w:rPr>
+          <w:rFonts w:ascii="Malgun Gothic" w:hAnsi="Malgun Gothic" w:eastAsia="Malgun Gothic" w:cs="Malgun Gothic"/>
+          <w:b w:val="0"/>
+        </w:rPr>
+        <w:t xml:space="preserve"> 문제해결의 업종 추천 절은 KIIT 원고와 같은 근거라 중복 규정 확인이 필요하다.</w:t>
       </w:r>
     </w:p>
     <w:tbl>

</xml_diff>